<commit_message>
Signals: new voice-over for edited scenes and cuts, rendered full + 30s + 3 module videos, updated scenario docx
Co-Authored-By: Claude Opus 5.5 <noreply@anthropic.com>
Claude-Session: https://claude.ai/code/session_01AeRMnDEu2RcqaCPQBFiC43
</commit_message>
<xml_diff>
--- a/kontur-market-video/Сценарий_ИИ_Бизнес_сигналы.docx
+++ b/kontur-market-video/Сценарий_ИИ_Бизнес_сигналы.docx
@@ -37,7 +37,7 @@
           <w:sz w:val="22"/>
           <w:szCs w:val="22"/>
         </w:rPr>
-        <w:t xml:space="preserve">Хронометраж: 3:23 (коридор 3:00–3:40). Формат 1920×1080, 30 fps. Голос: Gemini 3.8 Flash Lite TTS, голос Kore, спокойный деловой тон. Стиль: «Контур Blue» — белый фон, синий акцент #2291FF, крупная типографика.</w:t>
+        <w:t xml:space="preserve">Хронометраж: 3:32 (коридор 3:00–3:40). Формат 1920×1080, 30 fps. Голос: Gemini 3.8 Flash Lite TTS, голос Kore, спокойный деловой тон. Стиль: «Контур Blue» — белый фон, синий акцент #2291FF, крупная типографика.</w:t>
       </w:r>
     </w:p>
     <w:p>
@@ -50,7 +50,7 @@
           <w:sz w:val="22"/>
           <w:szCs w:val="22"/>
         </w:rPr>
-        <w:t xml:space="preserve">Экраны интерфейса в сценах аудита, дублей, сверки и сравнения сделаны как макеты с пометкой «Концепт интерфейса» до замены на реальные скринкасты. Данные тестовые.</w:t>
+        <w:t xml:space="preserve">Экраны интерфейса — реальные макеты из Figma «Цифровой опердир» (тестовые данные). В аудите дорисовано снижение прибыли на 12% и ИИ-вывод; панель дублей пересобрана в стиле интерфейса; название пункта меню заменено на «ИИ бизнес-сигналы».</w:t>
       </w:r>
     </w:p>
     <w:p>
@@ -208,7 +208,7 @@
                 <w:sz w:val="19"/>
                 <w:szCs w:val="19"/>
               </w:rPr>
-              <w:t xml:space="preserve">0:00–0:12</w:t>
+              <w:t xml:space="preserve">0:00–0:04</w:t>
             </w:r>
           </w:p>
         </w:tc>
@@ -232,7 +232,7 @@
                 <w:sz w:val="19"/>
                 <w:szCs w:val="19"/>
               </w:rPr>
-              <w:t xml:space="preserve">«В магазине достаточно данных. Но в ежедневной операционке не всегда понятно, где сейчас теряются деньги, появился риск или скрывается точка роста.»</w:t>
+              <w:t xml:space="preserve">— (без голоса)</w:t>
             </w:r>
           </w:p>
         </w:tc>
@@ -256,7 +256,7 @@
                 <w:sz w:val="19"/>
                 <w:szCs w:val="19"/>
               </w:rPr>
-              <w:t xml:space="preserve">Данные есть. Ясности нет.</w:t>
+              <w:t xml:space="preserve">ИИ Бизнес сигналы · от Контур.Маркет</w:t>
             </w:r>
           </w:p>
         </w:tc>
@@ -280,7 +280,7 @@
                 <w:sz w:val="19"/>
                 <w:szCs w:val="19"/>
               </w:rPr>
-              <w:t xml:space="preserve">Плавают карточки: продажи, остатки, списания, цены, маркировка. На словах «риск» и «роста» собираются в синий контур.</w:t>
+              <w:t xml:space="preserve">Графическая заставка: маскот ИИ Контура, вокруг рисуется синий контур, заголовок и логотип Контур.Маркета. Без голоса.</w:t>
             </w:r>
           </w:p>
         </w:tc>
@@ -306,7 +306,7 @@
                 <w:sz w:val="19"/>
                 <w:szCs w:val="19"/>
               </w:rPr>
-              <w:t xml:space="preserve">0:12–0:25</w:t>
+              <w:t xml:space="preserve">0:04–0:16</w:t>
             </w:r>
           </w:p>
         </w:tc>
@@ -330,7 +330,7 @@
                 <w:sz w:val="19"/>
                 <w:szCs w:val="19"/>
               </w:rPr>
-              <w:t xml:space="preserve">«Собственник или управляющий часто сам ищет причины изменений в продажах, остатках и списаниях. На это уходит время, а проблема может стать заметной слишком поздно.»</w:t>
+              <w:t xml:space="preserve">«В магазине достаточно данных. Но в ежедневной операционке не всегда понятно, где сейчас теряются деньги, появился риск или скрывается точка роста.»</w:t>
             </w:r>
           </w:p>
         </w:tc>
@@ -354,7 +354,7 @@
                 <w:sz w:val="19"/>
                 <w:szCs w:val="19"/>
               </w:rPr>
-              <w:t xml:space="preserve">Не новые отчёты. Рекомендации к действию.</w:t>
+              <w:t xml:space="preserve">Данные есть. Ясности нет.</w:t>
             </w:r>
           </w:p>
         </w:tc>
@@ -378,7 +378,7 @@
                 <w:sz w:val="19"/>
                 <w:szCs w:val="19"/>
               </w:rPr>
-              <w:t xml:space="preserve">Собственник, касса, стопка отчётов появляется по словам, крутятся часы. На «поздно» отчёты превращаются в карточки сигналов.</w:t>
+              <w:t xml:space="preserve">Плавают карточки: продажи, остатки, списания, цены, маркировка. На словах «риск» и «роста» собираются в синий контур.</w:t>
             </w:r>
           </w:p>
         </w:tc>
@@ -404,7 +404,7 @@
                 <w:sz w:val="19"/>
                 <w:szCs w:val="19"/>
               </w:rPr>
-              <w:t xml:space="preserve">0:25–0:40</w:t>
+              <w:t xml:space="preserve">0:16–0:28</w:t>
             </w:r>
           </w:p>
         </w:tc>
@@ -428,7 +428,7 @@
                 <w:sz w:val="19"/>
                 <w:szCs w:val="19"/>
               </w:rPr>
-              <w:t xml:space="preserve">«ИИ Бизнес сигналы нужны тем, кто управляет магазином сам, у кого отчёты уже есть, но нет времени вручную искать причины, и кому важно раньше замечать риски, потери и возможности для роста.»</w:t>
+              <w:t xml:space="preserve">«Собственник или управляющий часто сам ищет причины изменений в продажах, остатках и списаниях. На это уходит время, а проблема может стать заметной слишком поздно.»</w:t>
             </w:r>
           </w:p>
         </w:tc>
@@ -452,7 +452,7 @@
                 <w:sz w:val="19"/>
                 <w:szCs w:val="19"/>
               </w:rPr>
-              <w:t xml:space="preserve">Для кого: Управляю сам / Отчёты есть, времени нет / Не хочу упускать деньги</w:t>
+              <w:t xml:space="preserve">Не новые отчёты. Рекомендации к действию.</w:t>
             </w:r>
           </w:p>
         </w:tc>
@@ -476,7 +476,7 @@
                 <w:sz w:val="19"/>
                 <w:szCs w:val="19"/>
               </w:rPr>
-              <w:t xml:space="preserve">Три плитки появляются по фразам.</w:t>
+              <w:t xml:space="preserve">Собственник, касса, стопка отчётов появляется по словам, крутятся часы. На «поздно» отчёты превращаются в карточки сигналов.</w:t>
             </w:r>
           </w:p>
         </w:tc>
@@ -502,7 +502,7 @@
                 <w:sz w:val="19"/>
                 <w:szCs w:val="19"/>
               </w:rPr>
-              <w:t xml:space="preserve">0:40–0:53</w:t>
+              <w:t xml:space="preserve">0:28–0:43</w:t>
             </w:r>
           </w:p>
         </w:tc>
@@ -526,7 +526,7 @@
                 <w:sz w:val="19"/>
                 <w:szCs w:val="19"/>
               </w:rPr>
-              <w:t xml:space="preserve">«ИИ Бизнес сигналы анализируют данные Контур Маркета, находят отклонения, объясняют возможную причину и рекомендуют, что проверить. Финальное решение всегда остаётся за вами.»</w:t>
+              <w:t xml:space="preserve">«ИИ Бизнес сигналы нужны тем, кто управляет магазином сам, у кого отчёты уже есть, но нет времени вручную искать причины, и кому важно раньше замечать риски, потери и возможности для роста.»</w:t>
             </w:r>
           </w:p>
         </w:tc>
@@ -550,7 +550,7 @@
                 <w:sz w:val="19"/>
                 <w:szCs w:val="19"/>
               </w:rPr>
-              <w:t xml:space="preserve">Данные → сигнал → причина → действие</w:t>
+              <w:t xml:space="preserve">Для кого: Управляю сам / Отчёты есть, времени нет / Не хочу упускать деньги</w:t>
             </w:r>
           </w:p>
         </w:tc>
@@ -574,7 +574,7 @@
                 <w:sz w:val="19"/>
                 <w:szCs w:val="19"/>
               </w:rPr>
-              <w:t xml:space="preserve">Цепочка из шести узлов; последний — «Решение за вами» с галочкой.</w:t>
+              <w:t xml:space="preserve">Три плитки появляются по фразам.</w:t>
             </w:r>
           </w:p>
         </w:tc>
@@ -600,7 +600,7 @@
                 <w:sz w:val="19"/>
                 <w:szCs w:val="19"/>
               </w:rPr>
-              <w:t xml:space="preserve">0:53–1:05</w:t>
+              <w:t xml:space="preserve">0:43–0:56</w:t>
             </w:r>
           </w:p>
         </w:tc>
@@ -624,7 +624,7 @@
                 <w:sz w:val="19"/>
                 <w:szCs w:val="19"/>
               </w:rPr>
-              <w:t xml:space="preserve">«Это ИИ Контура: Контур Маркет уже работает с данными вашего бизнеса, а сигналы используют их внутри системы. Не нужно передавать данные в отдельный сторонний сервис.»</w:t>
+              <w:t xml:space="preserve">«ИИ Бизнес сигналы анализируют данные Контур Маркета, находят отклонения, объясняют возможную причину и рекомендуют, что проверить. Финальное решение всегда остаётся за вами.»</w:t>
             </w:r>
           </w:p>
         </w:tc>
@@ -648,7 +648,7 @@
                 <w:sz w:val="19"/>
                 <w:szCs w:val="19"/>
               </w:rPr>
-              <w:t xml:space="preserve">Данные остаются внутри Контур.Маркета</w:t>
+              <w:t xml:space="preserve">Данные → сигнал → причина → действие</w:t>
             </w:r>
           </w:p>
         </w:tc>
@@ -672,7 +672,7 @@
                 <w:sz w:val="19"/>
                 <w:szCs w:val="19"/>
               </w:rPr>
-              <w:t xml:space="preserve">Щит в синем круге переходит в окно интерфейса Маркета (скриншот с сайта), плашка «Без сторонних сервисов».</w:t>
+              <w:t xml:space="preserve">Цепочка из шести узлов; последний — «Решение за вами» с галочкой.</w:t>
             </w:r>
           </w:p>
         </w:tc>
@@ -698,7 +698,7 @@
                 <w:sz w:val="19"/>
                 <w:szCs w:val="19"/>
               </w:rPr>
-              <w:t xml:space="preserve">1:05–1:14</w:t>
+              <w:t xml:space="preserve">0:56–1:09</w:t>
             </w:r>
           </w:p>
         </w:tc>
@@ -722,7 +722,7 @@
                 <w:sz w:val="19"/>
                 <w:szCs w:val="19"/>
               </w:rPr>
-              <w:t xml:space="preserve">«В MVP три ИИ-модуля: аудит торговой точки, сверка с Честным Знаком и сравнение с конкурентами.»</w:t>
+              <w:t xml:space="preserve">«Это ИИ Контура: Контур Маркет уже работает с данными вашего бизнеса, а сигналы используют их внутри системы. Не нужно передавать данные в отдельный сторонний сервис.»</w:t>
             </w:r>
           </w:p>
         </w:tc>
@@ -746,7 +746,7 @@
                 <w:sz w:val="19"/>
                 <w:szCs w:val="19"/>
               </w:rPr>
-              <w:t xml:space="preserve">3 модуля для ежедневных решений</w:t>
+              <w:t xml:space="preserve">Данные остаются внутри Контур.Маркета</w:t>
             </w:r>
           </w:p>
         </w:tc>
@@ -770,7 +770,7 @@
                 <w:sz w:val="19"/>
                 <w:szCs w:val="19"/>
               </w:rPr>
-              <w:t xml:space="preserve">Три синие карточки модулей.</w:t>
+              <w:t xml:space="preserve">Щит в синем круге переходит в реальный экран хаба «ИИ бизнес-сигналы», плашка «Без сторонних сервисов».</w:t>
             </w:r>
           </w:p>
         </w:tc>
@@ -796,7 +796,7 @@
                 <w:sz w:val="19"/>
                 <w:szCs w:val="19"/>
               </w:rPr>
-              <w:t xml:space="preserve">1:14–1:30</w:t>
+              <w:t xml:space="preserve">1:09–1:18</w:t>
             </w:r>
           </w:p>
         </w:tc>
@@ -820,7 +820,7 @@
                 <w:sz w:val="19"/>
                 <w:szCs w:val="19"/>
               </w:rPr>
-              <w:t xml:space="preserve">«Аудит торговой точки помогает понять, что изменилось в показателях и почему. Например, сигнал показывает снижение прибыли, товары или категории, которые повлияли на результат, и предлагает проверить цены или закупочные условия.»</w:t>
+              <w:t xml:space="preserve">«В MVP три ИИ-модуля: аудит торговой точки, сверка с Честным Знаком и сравнение с конкурентами.»</w:t>
             </w:r>
           </w:p>
         </w:tc>
@@ -844,7 +844,7 @@
                 <w:sz w:val="19"/>
                 <w:szCs w:val="19"/>
               </w:rPr>
-              <w:t xml:space="preserve">Сигнал → Причина → Что проверить</w:t>
+              <w:t xml:space="preserve">3 модуля для ежедневных решений</w:t>
             </w:r>
           </w:p>
         </w:tc>
@@ -868,7 +868,7 @@
                 <w:sz w:val="19"/>
                 <w:szCs w:val="19"/>
               </w:rPr>
-              <w:t xml:space="preserve">Падающий график. Затем макет экрана: по очереди подсвечиваются «Прибыль −12%», причины по категориям, «Что проверить». Курсор нажимает «Перейти к проверке». [Концепт интерфейса]</w:t>
+              <w:t xml:space="preserve">Три синие карточки модулей.</w:t>
             </w:r>
           </w:p>
         </w:tc>
@@ -894,7 +894,7 @@
                 <w:sz w:val="19"/>
                 <w:szCs w:val="19"/>
               </w:rPr>
-              <w:t xml:space="preserve">1:30–1:41</w:t>
+              <w:t xml:space="preserve">1:18–1:34</w:t>
             </w:r>
           </w:p>
         </w:tc>
@@ -918,7 +918,7 @@
                 <w:sz w:val="19"/>
                 <w:szCs w:val="19"/>
               </w:rPr>
-              <w:t xml:space="preserve">«Аудит также может найти вероятные дубли товарных карточек. Пользователь подтверждает или отклоняет совпадение — ручной контроль сохраняется.»</w:t>
+              <w:t xml:space="preserve">«Аудит торговой точки помогает понять, что изменилось в показателях и почему. Например, сигнал показывает снижение прибыли, товары или категории, которые повлияли на результат, и предлагает проверить цены или закупочные условия.»</w:t>
             </w:r>
           </w:p>
         </w:tc>
@@ -942,7 +942,7 @@
                 <w:sz w:val="19"/>
                 <w:szCs w:val="19"/>
               </w:rPr>
-              <w:t xml:space="preserve">Решение — за вами</w:t>
+              <w:t xml:space="preserve">Сигнал → Причина → Что проверить</w:t>
             </w:r>
           </w:p>
         </w:tc>
@@ -966,7 +966,7 @@
                 <w:sz w:val="19"/>
                 <w:szCs w:val="19"/>
               </w:rPr>
-              <w:t xml:space="preserve">Макет: пару «Молоко» подтверждают — карточки объединяются; «Кефир 1% / 2,5%» отклоняют как «Разные товары». [Концепт интерфейса]</w:t>
+              <w:t xml:space="preserve">Падающий график. Затем реальный экран «Прибыль»: камера наезжает на шапку (дорисовано «23 080 ₽ ↓ 12%») и график, затем на категории со снижением, затем на ИИ-вывод с рекомендацией проверить цены и закупочные условия.</w:t>
             </w:r>
           </w:p>
         </w:tc>
@@ -992,7 +992,7 @@
                 <w:sz w:val="19"/>
                 <w:szCs w:val="19"/>
               </w:rPr>
-              <w:t xml:space="preserve">1:41–1:56</w:t>
+              <w:t xml:space="preserve">1:34–1:45</w:t>
             </w:r>
           </w:p>
         </w:tc>
@@ -1016,7 +1016,7 @@
                 <w:sz w:val="19"/>
                 <w:szCs w:val="19"/>
               </w:rPr>
-              <w:t xml:space="preserve">«Сверка с Честным Знаком подсвечивает коды, не введённые в оборот, истёкший или близкий к истечению срок годности и залежавшиеся остатки. Это помогает организовать проверку проблемного товара до продажи.»</w:t>
+              <w:t xml:space="preserve">«Аудит также может найти вероятные дубли товарных карточек. Пользователь подтверждает или отклоняет совпадение — ручной контроль сохраняется.»</w:t>
             </w:r>
           </w:p>
         </w:tc>
@@ -1040,7 +1040,7 @@
                 <w:sz w:val="19"/>
                 <w:szCs w:val="19"/>
               </w:rPr>
-              <w:t xml:space="preserve">С 1 сентября 2026 — автоштрафы по данным Честного Знака</w:t>
+              <w:t xml:space="preserve">Решение — за вами</w:t>
             </w:r>
           </w:p>
         </w:tc>
@@ -1064,7 +1064,7 @@
                 <w:sz w:val="19"/>
                 <w:szCs w:val="19"/>
               </w:rPr>
-              <w:t xml:space="preserve">Макет: фильтр товарной группы, коды со статусами (зелёный, жёлтый, красный), курсор открывает детали одного кода. [Концепт интерфейса]</w:t>
+              <w:t xml:space="preserve">Реальная вкладка «Дубли»: курсор выбирает «Молоко «Домик в деревне»», справа выезжает панель с карточками группы, подсвечиваются кнопки «Объединить карточки» и «Это не дубли». Плашка «Решение — за вами».</w:t>
             </w:r>
           </w:p>
         </w:tc>
@@ -1090,7 +1090,7 @@
                 <w:sz w:val="19"/>
                 <w:szCs w:val="19"/>
               </w:rPr>
-              <w:t xml:space="preserve">1:56–2:18</w:t>
+              <w:t xml:space="preserve">1:45–2:00</w:t>
             </w:r>
           </w:p>
         </w:tc>
@@ -1114,7 +1114,7 @@
                 <w:sz w:val="19"/>
                 <w:szCs w:val="19"/>
               </w:rPr>
-              <w:t xml:space="preserve">«С первого сентября 2026 года работает механизм автоштрафов по данным Честного Знака. Например, за игнорирование запрета на продажу просроченного товара — 10 тысяч рублей за единицу для ИП и 20 тысяч для юрлица. Сверка помогает заметить риск, но не гарантирует отсутствие штрафов.»</w:t>
+              <w:t xml:space="preserve">«Сверка с Честным Знаком подсвечивает коды, не введённые в оборот, истёкший или близкий к истечению срок годности и залежавшиеся остатки. Это помогает организовать проверку проблемного товара до продажи.»</w:t>
             </w:r>
           </w:p>
         </w:tc>
@@ -1138,7 +1138,7 @@
                 <w:sz w:val="19"/>
                 <w:szCs w:val="19"/>
               </w:rPr>
-              <w:t xml:space="preserve">10 000 ₽ — ИП / 20 000 ₽ — юрлицо. За каждую единицу просроченного товара при игнорировании запрета на продажу</w:t>
+              <w:t xml:space="preserve">С 1 сентября 2026 — автоштрафы по данным Честного Знака</w:t>
             </w:r>
           </w:p>
         </w:tc>
@@ -1162,7 +1162,7 @@
                 <w:sz w:val="19"/>
                 <w:szCs w:val="19"/>
               </w:rPr>
-              <w:t xml:space="preserve">Две крупные цифры. Сноска: «Источник: Роспотребнадзор, разъяснение от 19.08.2026» и дисклеймер об ответственности продавца.</w:t>
+              <w:t xml:space="preserve">Реальный экран сверки: подсветка рисков и предупреждений, товаров с истёкшим сроком, сигнала «Долго на балансе»; клик по сигналу — выезжает панель «Срок годности истекает» с рекомендациями.</w:t>
             </w:r>
           </w:p>
         </w:tc>
@@ -1188,7 +1188,7 @@
                 <w:sz w:val="19"/>
                 <w:szCs w:val="19"/>
               </w:rPr>
-              <w:t xml:space="preserve">2:18–2:40</w:t>
+              <w:t xml:space="preserve">2:00–2:21</w:t>
             </w:r>
           </w:p>
         </w:tc>
@@ -1212,7 +1212,7 @@
                 <w:sz w:val="19"/>
                 <w:szCs w:val="19"/>
               </w:rPr>
-              <w:t xml:space="preserve">«Сравнение с конкурентами помогает видеть рынок вокруг магазина. Если цена у конкурентов выше на 15 рублей, а товар продаётся по 20–50 единиц в день, потенциальная дополнительная выручка по одному SKU составляет от 9 до 22 с половиной тысяч рублей в месяц — если после изменения цены сохраняется спрос.»</w:t>
+              <w:t xml:space="preserve">«С первого сентября 2026 года работает механизм автоштрафов по данным Честного Знака. Например, за игнорирование запрета на продажу просроченного товара — 10 тысяч рублей за единицу для ИП и 20 тысяч для юрлица. Сверка помогает заметить риск, но не гарантирует отсутствие штрафов.»</w:t>
             </w:r>
           </w:p>
         </w:tc>
@@ -1236,7 +1236,7 @@
                 <w:sz w:val="19"/>
                 <w:szCs w:val="19"/>
               </w:rPr>
-              <w:t xml:space="preserve">15 ₽ × 20–50 шт. × 30 → 9 000–22 500 ₽ на одном SKU в месяц*</w:t>
+              <w:t xml:space="preserve">10 000 ₽ — ИП / 20 000 ₽ — юрлицо. За каждую единицу просроченного товара при игнорировании запрета на продажу</w:t>
             </w:r>
           </w:p>
         </w:tc>
@@ -1260,7 +1260,7 @@
                 <w:sz w:val="19"/>
                 <w:szCs w:val="19"/>
               </w:rPr>
-              <w:t xml:space="preserve">Схема района: «Ваш магазин 100 ₽», конкуренты 115–118 ₽, счётчик суммы, «Рекомендация: проверьте цену». Сноска про расчётный сценарий.</w:t>
+              <w:t xml:space="preserve">Две крупные цифры. Сноска: «Источник: Роспотребнадзор, разъяснение от 19.08.2026» и дисклеймер об ответственности продавца.</w:t>
             </w:r>
           </w:p>
         </w:tc>
@@ -1286,7 +1286,7 @@
                 <w:sz w:val="19"/>
                 <w:szCs w:val="19"/>
               </w:rPr>
-              <w:t xml:space="preserve">2:40–2:53</w:t>
+              <w:t xml:space="preserve">2:21–2:46</w:t>
             </w:r>
           </w:p>
         </w:tc>
@@ -1310,7 +1310,7 @@
                 <w:sz w:val="19"/>
                 <w:szCs w:val="19"/>
               </w:rPr>
-              <w:t xml:space="preserve">«Вместо ручного поиска по отчётам — три сценария: понять, что происходит внутри точки; вовремя проверить риск маркировки; увидеть возможность относительно рынка.»</w:t>
+              <w:t xml:space="preserve">«Сравнение с конкурентами помогает видеть рынок вокруг магазина. Если цена у конкурентов выше на 15 рублей, а товар продаётся по 20–50 единиц в день, потенциальная дополнительная выручка по одной позиции составляет от 9 до 22 с половиной тысяч рублей в месяц — если после изменения цены сохраняется спрос.»</w:t>
             </w:r>
           </w:p>
         </w:tc>
@@ -1334,7 +1334,7 @@
                 <w:sz w:val="19"/>
                 <w:szCs w:val="19"/>
               </w:rPr>
-              <w:t xml:space="preserve">Понять / Проверить риск / Найти возможность</w:t>
+              <w:t xml:space="preserve">15 ₽ × 20–50 шт. × 30 → 9 000–22 500 ₽ на одной позиции в месяц*</w:t>
             </w:r>
           </w:p>
         </w:tc>
@@ -1358,7 +1358,7 @@
                 <w:sz w:val="19"/>
                 <w:szCs w:val="19"/>
               </w:rPr>
-              <w:t xml:space="preserve">Три модуля, под каждым появляется итог.</w:t>
+              <w:t xml:space="preserve">Реальный экран сравнения: обзор, подсветка позиции «Дешевле рынка на 10%», выезжает карточка товара с ценами конкурентов. Экран уезжает влево, справа расчёт со счётчиком. Сноска про расчётный сценарий.</w:t>
             </w:r>
           </w:p>
         </w:tc>
@@ -1384,7 +1384,7 @@
                 <w:sz w:val="19"/>
                 <w:szCs w:val="19"/>
               </w:rPr>
-              <w:t xml:space="preserve">2:53–3:11</w:t>
+              <w:t xml:space="preserve">2:46–2:59</w:t>
             </w:r>
           </w:p>
         </w:tc>
@@ -1408,7 +1408,7 @@
                 <w:sz w:val="19"/>
                 <w:szCs w:val="19"/>
               </w:rPr>
-              <w:t xml:space="preserve">«Если управляющий тратит около пяти часов в неделю на первичный поиск точек роста, это до 20 часов в месяц. ИИ Бизнес сигналы помогают начать анализ с конкретного сигнала и его причины. Стоимость модификатора — 15 тысяч рублей.»</w:t>
+              <w:t xml:space="preserve">«Вместо ручного поиска по отчётам — три сценария: понять, что происходит внутри точки; вовремя проверить риск маркировки; увидеть возможность относительно рынка.»</w:t>
             </w:r>
           </w:p>
         </w:tc>
@@ -1432,7 +1432,7 @@
                 <w:sz w:val="19"/>
                 <w:szCs w:val="19"/>
               </w:rPr>
-              <w:t xml:space="preserve">5 ч → до 20 ч/мес.* · ИИ Бизнес сигналы — 15 000 ₽</w:t>
+              <w:t xml:space="preserve">Понять / Проверить риск / Найти возможность</w:t>
             </w:r>
           </w:p>
         </w:tc>
@@ -1456,7 +1456,7 @@
                 <w:sz w:val="19"/>
                 <w:szCs w:val="19"/>
               </w:rPr>
-              <w:t xml:space="preserve">Цифры и плашка цены. Сноска: не гарантия эффекта, стоимость требует подтверждения.</w:t>
+              <w:t xml:space="preserve">Три модуля, под каждым появляется итог.</w:t>
             </w:r>
           </w:p>
         </w:tc>
@@ -1482,7 +1482,7 @@
                 <w:sz w:val="19"/>
                 <w:szCs w:val="19"/>
               </w:rPr>
-              <w:t xml:space="preserve">3:11–3:23</w:t>
+              <w:t xml:space="preserve">2:59–3:23</w:t>
             </w:r>
           </w:p>
         </w:tc>
@@ -1506,7 +1506,7 @@
                 <w:sz w:val="19"/>
                 <w:szCs w:val="19"/>
               </w:rPr>
-              <w:t xml:space="preserve">«Разберите одну задачу вашего магазина вместе с экспертом Контур Маркета. За 20–30 минут определим нужный сценарий, покажем логику сигналов и уточним условия подключения.»</w:t>
+              <w:t xml:space="preserve">«Если управляющий тратит около пяти часов в неделю на первичный поиск точек роста, это до 20 часов в месяц. ИИ Бизнес сигналы помогают начать анализ с конкретного сигнала и его причины. Стоимость модификатора — 22 тысячи рублей, а до 30 ноября действует скидка до 32 процентов.»</w:t>
             </w:r>
           </w:p>
         </w:tc>
@@ -1530,7 +1530,7 @@
                 <w:sz w:val="19"/>
                 <w:szCs w:val="19"/>
               </w:rPr>
-              <w:t xml:space="preserve">Разберите одну задачу вашего магазина · Демонстрация 20–30 минут</w:t>
+              <w:t xml:space="preserve">5 ч → до 20 ч/мес.* · ИИ Бизнес сигналы — 22 000 ₽ · Скидка до 32% — до 30 ноября</w:t>
             </w:r>
           </w:p>
         </w:tc>
@@ -1554,7 +1554,105 @@
                 <w:sz w:val="19"/>
                 <w:szCs w:val="19"/>
               </w:rPr>
-              <w:t xml:space="preserve">Синий финальный экран: три пункта повестки с галочками, рамка «QR-код / ссылка после утверждения».</w:t>
+              <w:t xml:space="preserve">Цифры и плашка цены. Сноска: не гарантия эффекта, стоимость требует подтверждения.</w:t>
+            </w:r>
+          </w:p>
+        </w:tc>
+      </w:tr>
+      <w:tr>
+        <w:tc>
+          <w:tcPr>
+            <w:tcW w:type="dxa" w:w="1100"/>
+            <w:tcMar>
+              <w:top w:type="dxa" w:w="80"/>
+              <w:left w:type="dxa" w:w="100"/>
+              <w:bottom w:type="dxa" w:w="80"/>
+              <w:right w:type="dxa" w:w="100"/>
+            </w:tcMar>
+          </w:tcPr>
+          <w:p>
+            <w:r>
+              <w:rPr>
+                <w:rFonts w:ascii="Arial" w:cs="Arial" w:eastAsia="Arial" w:hAnsi="Arial"/>
+                <w:b w:val="false"/>
+                <w:bCs w:val="false"/>
+                <w:color w:val="1F2328"/>
+                <w:sz w:val="19"/>
+                <w:szCs w:val="19"/>
+              </w:rPr>
+              <w:t xml:space="preserve">3:23–3:32</w:t>
+            </w:r>
+          </w:p>
+        </w:tc>
+        <w:tc>
+          <w:tcPr>
+            <w:tcW w:type="dxa" w:w="4300"/>
+            <w:tcMar>
+              <w:top w:type="dxa" w:w="80"/>
+              <w:left w:type="dxa" w:w="100"/>
+              <w:bottom w:type="dxa" w:w="80"/>
+              <w:right w:type="dxa" w:w="100"/>
+            </w:tcMar>
+          </w:tcPr>
+          <w:p>
+            <w:r>
+              <w:rPr>
+                <w:rFonts w:ascii="Arial" w:cs="Arial" w:eastAsia="Arial" w:hAnsi="Arial"/>
+                <w:b w:val="false"/>
+                <w:bCs w:val="false"/>
+                <w:color w:val="1F2328"/>
+                <w:sz w:val="19"/>
+                <w:szCs w:val="19"/>
+              </w:rPr>
+              <w:t xml:space="preserve">«Подключите ИИ Бизнес сигналы — оставляйте заявку на сайте Контур Маркета.»</w:t>
+            </w:r>
+          </w:p>
+        </w:tc>
+        <w:tc>
+          <w:tcPr>
+            <w:tcW w:type="dxa" w:w="3000"/>
+            <w:tcMar>
+              <w:top w:type="dxa" w:w="80"/>
+              <w:left w:type="dxa" w:w="100"/>
+              <w:bottom w:type="dxa" w:w="80"/>
+              <w:right w:type="dxa" w:w="100"/>
+            </w:tcMar>
+          </w:tcPr>
+          <w:p>
+            <w:r>
+              <w:rPr>
+                <w:rFonts w:ascii="Arial" w:cs="Arial" w:eastAsia="Arial" w:hAnsi="Arial"/>
+                <w:b w:val="false"/>
+                <w:bCs w:val="false"/>
+                <w:color w:val="1F2328"/>
+                <w:sz w:val="19"/>
+                <w:szCs w:val="19"/>
+              </w:rPr>
+              <w:t xml:space="preserve">Оставляйте заявку на сайте · кнопка «Оставить заявку» · kontur.ru/market</w:t>
+            </w:r>
+          </w:p>
+        </w:tc>
+        <w:tc>
+          <w:tcPr>
+            <w:tcW w:type="dxa" w:w="5000"/>
+            <w:tcMar>
+              <w:top w:type="dxa" w:w="80"/>
+              <w:left w:type="dxa" w:w="100"/>
+              <w:bottom w:type="dxa" w:w="80"/>
+              <w:right w:type="dxa" w:w="100"/>
+            </w:tcMar>
+          </w:tcPr>
+          <w:p>
+            <w:r>
+              <w:rPr>
+                <w:rFonts w:ascii="Arial" w:cs="Arial" w:eastAsia="Arial" w:hAnsi="Arial"/>
+                <w:b w:val="false"/>
+                <w:bCs w:val="false"/>
+                <w:color w:val="1F2328"/>
+                <w:sz w:val="19"/>
+                <w:szCs w:val="19"/>
+              </w:rPr>
+              <w:t xml:space="preserve">Синий финальный экран: маскот, «Оставляйте заявку на сайте», кнопка «Оставить заявку», адрес сайта, логотип.</w:t>
             </w:r>
           </w:p>
         </w:tc>
@@ -1681,7 +1779,7 @@
           <w:sz w:val="22"/>
           <w:szCs w:val="22"/>
         </w:rPr>
-        <w:t xml:space="preserve">Цена модификатора 15 000 ₽, период действия, НДС.</w:t>
+        <w:t xml:space="preserve">Условия скидки до 32% до 30 ноября (на что распространяется, НДС).</w:t>
       </w:r>
     </w:p>
     <w:p>
@@ -1715,7 +1813,7 @@
           <w:sz w:val="22"/>
           <w:szCs w:val="22"/>
         </w:rPr>
-        <w:t xml:space="preserve">Ссылка и QR-код для финального CTA.</w:t>
+        <w:t xml:space="preserve">Адрес для заявки в финальном кадре (сейчас kontur.ru/market).</w:t>
       </w:r>
     </w:p>
     <w:p>
@@ -1732,7 +1830,7 @@
           <w:sz w:val="22"/>
           <w:szCs w:val="22"/>
         </w:rPr>
-        <w:t xml:space="preserve">Замена UI-макетов на реальные скринкасты.</w:t>
+        <w:t xml:space="preserve">Цифры в дорисованном сигнале аудита (−12%, 23 080 ₽).</w:t>
       </w:r>
     </w:p>
     <w:sectPr>

</xml_diff>